<commit_message>
Deployed 48a811d with MkDocs version: 1.6.1
</commit_message>
<xml_diff>
--- a/tema2/plantillas/Actividad_2_5_PSP_Plantilla.docx
+++ b/tema2/plantillas/Actividad_2_5_PSP_Plantilla.docx
@@ -258,7 +258,7 @@
                 <w:sz w:val="20"/>
                 <w:szCs w:val="20"/>
               </w:rPr>
-              <w:t xml:space="preserve">Completar la política de autorización de tu GameVault, ruta a ruta y cerrada por defecto; cerrar los últimos huecos de formato que quedaban abiertos (el 403 y el 404 sin tu ErrorResponse); y verificar con tests automatizados que esa política hace exactamente lo que dice, integrados en tu CI.</w:t>
+              <w:t xml:space="preserve">Completar la política de autorización de tu GameVault, ruta a ruta y cerrada por defecto; y cerrar los últimos huecos de formato que quedaban abiertos (el 403 y el 404 sin tu ErrorResponse).</w:t>
             </w:r>
           </w:p>
         </w:tc>
@@ -349,7 +349,7 @@
                 <w:sz w:val="20"/>
                 <w:szCs w:val="20"/>
               </w:rPr>
-              <w:t xml:space="preserve">Este documento relleno: la tabla de EstudioController con su justificación (Paso 1), la captura de docs/seguridad.md, la captura y la pregunta del Paso 2, la captura del Paso 3, las dos capturas del Paso 4, las dos capturas del Paso 5, la captura del Paso 6, la captura de los tests en verde (Paso 7 y 8), el repaso del Cierre del tema y la captura de GitHub Actions en verde.</w:t>
+              <w:t xml:space="preserve">Este documento relleno: la tabla de EstudioController con su justificación (Paso 1), la captura de docs/seguridad.md, la captura y la pregunta del Paso 2, la captura del Paso 3, las dos capturas del Paso 4, las dos capturas del Paso 5, la captura del Paso 6, y el repaso del Cierre del tema.</w:t>
             </w:r>
           </w:p>
         </w:tc>
@@ -1944,7 +1944,7 @@
           <w:sz w:val="26"/>
           <w:szCs w:val="26"/>
         </w:rPr>
-        <w:t xml:space="preserve">Pasos 7 y 8 — Tests de seguridad</w:t>
+        <w:t xml:space="preserve">Cierre del tema</w:t>
       </w:r>
     </w:p>
     <w:p>
@@ -1968,7 +1968,7 @@
           <w:sz w:val="24"/>
           <w:szCs w:val="24"/>
         </w:rPr>
-        <w:t xml:space="preserve">Captura</w:t>
+        <w:t xml:space="preserve">Repaso propio de la evolución del tema (4-5 frases)</w:t>
       </w:r>
     </w:p>
     <w:tbl>
@@ -1987,41 +1987,8 @@
         <w:gridCol w:w="9638"/>
       </w:tblGrid>
       <w:tr>
-        <w:tc>
-          <w:tcPr>
-            <w:tcW w:type="dxa" w:w="9638"/>
-            <w:tcBorders>
-              <w:top w:val="none" w:color="FFFFFF" w:sz="0"/>
-              <w:left w:val="none" w:color="FFFFFF" w:sz="0"/>
-              <w:bottom w:val="none" w:color="FFFFFF" w:sz="0"/>
-              <w:right w:val="none" w:color="FFFFFF" w:sz="0"/>
-            </w:tcBorders>
-            <w:shd w:fill="6D4C41" w:val="clear"/>
-            <w:tcMar>
-              <w:top w:type="dxa" w:w="80"/>
-              <w:left w:type="dxa" w:w="160"/>
-              <w:bottom w:type="dxa" w:w="80"/>
-              <w:right w:type="dxa" w:w="160"/>
-            </w:tcMar>
-          </w:tcPr>
-          <w:p>
-            <w:r>
-              <w:rPr>
-                <w:rFonts w:ascii="Arial" w:cs="Arial" w:eastAsia="Arial" w:hAnsi="Arial"/>
-                <w:b/>
-                <w:bCs/>
-                <w:color w:val="FFFFFF"/>
-                <w:sz w:val="20"/>
-                <w:szCs w:val="20"/>
-              </w:rPr>
-              <w:t xml:space="preserve">📸 Ejecución de todos tus tests de seguridad (Videojuego y Estudio), todos en verde</w:t>
-            </w:r>
-          </w:p>
-        </w:tc>
-      </w:tr>
-      <w:tr>
         <w:trPr>
-          <w:trHeight w:val="2400"/>
+          <w:trHeight w:val="480"/>
         </w:trPr>
         <w:tc>
           <w:tcPr>
@@ -2034,98 +2001,23 @@
             </w:tcBorders>
             <w:shd w:fill="FAFAFA" w:val="clear"/>
             <w:tcMar>
-              <w:top w:type="dxa" w:w="80"/>
+              <w:top w:type="dxa" w:w="60"/>
               <w:left w:type="dxa" w:w="160"/>
-              <w:bottom w:type="dxa" w:w="80"/>
+              <w:bottom w:type="dxa" w:w="60"/>
               <w:right w:type="dxa" w:w="160"/>
             </w:tcMar>
           </w:tcPr>
           <w:p>
-            <w:pPr>
-              <w:jc w:val="center"/>
-            </w:pPr>
-            <w:r>
-              <w:rPr>
-                <w:rFonts w:ascii="Arial" w:cs="Arial" w:eastAsia="Arial" w:hAnsi="Arial"/>
-                <w:i/>
-                <w:iCs/>
-                <w:color w:val="757575"/>
-                <w:sz w:val="20"/>
-                <w:szCs w:val="20"/>
-              </w:rPr>
-              <w:t xml:space="preserve">[Pega aquí la captura de pantalla]</w:t>
-            </w:r>
-          </w:p>
-        </w:tc>
-      </w:tr>
-    </w:tbl>
-    <w:p>
-      <w:pPr>
-        <w:spacing w:after="200"/>
-      </w:pPr>
-    </w:p>
-    <w:p>
-      <w:r>
-        <w:br w:type="page"/>
-      </w:r>
-    </w:p>
-    <w:p>
-      <w:pPr>
-        <w:shd w:fill="6D4C41" w:val="clear"/>
-        <w:spacing w:after="0" w:before="320"/>
-        <w:ind w:left="200" w:right="200"/>
-      </w:pPr>
-      <w:r>
-        <w:rPr>
-          <w:rFonts w:ascii="Arial" w:cs="Arial" w:eastAsia="Arial" w:hAnsi="Arial"/>
-          <w:b/>
-          <w:bCs/>
-          <w:color w:val="FFFFFF"/>
-          <w:sz w:val="26"/>
-          <w:szCs w:val="26"/>
-        </w:rPr>
-        <w:t xml:space="preserve">Cierre del tema</w:t>
-      </w:r>
-    </w:p>
-    <w:p>
-      <w:pPr>
-        <w:spacing w:after="80"/>
-      </w:pPr>
-    </w:p>
-    <w:p>
-      <w:pPr>
-        <w:pBdr>
-          <w:bottom w:val="single" w:color="FFA000" w:sz="4" w:space="1"/>
-        </w:pBdr>
-        <w:spacing w:after="120" w:before="240"/>
-      </w:pPr>
-      <w:r>
-        <w:rPr>
-          <w:rFonts w:ascii="Arial" w:cs="Arial" w:eastAsia="Arial" w:hAnsi="Arial"/>
-          <w:b/>
-          <w:bCs/>
-          <w:color w:val="6D4C41"/>
-          <w:sz w:val="24"/>
-          <w:szCs w:val="24"/>
-        </w:rPr>
-        <w:t xml:space="preserve">Repaso propio de la evolución del tema (4-5 frases)</w:t>
-      </w:r>
-    </w:p>
-    <w:tbl>
-      <w:tblPr>
-        <w:tblW w:type="dxa" w:w="9638"/>
-        <w:tblBorders>
-          <w:top w:val="single" w:color="auto" w:sz="4"/>
-          <w:left w:val="single" w:color="auto" w:sz="4"/>
-          <w:bottom w:val="single" w:color="auto" w:sz="4"/>
-          <w:right w:val="single" w:color="auto" w:sz="4"/>
-          <w:insideH w:val="single" w:color="auto" w:sz="4"/>
-          <w:insideV w:val="single" w:color="auto" w:sz="4"/>
-        </w:tblBorders>
-      </w:tblPr>
-      <w:tblGrid>
-        <w:gridCol w:w="9638"/>
-      </w:tblGrid>
+            <w:r>
+              <w:rPr>
+                <w:sz w:val="22"/>
+                <w:szCs w:val="22"/>
+              </w:rPr>
+              <w:t xml:space="preserve"/>
+            </w:r>
+          </w:p>
+        </w:tc>
+      </w:tr>
       <w:tr>
         <w:trPr>
           <w:trHeight w:val="480"/>
@@ -2282,150 +2174,6 @@
                 <w:szCs w:val="22"/>
               </w:rPr>
               <w:t xml:space="preserve"/>
-            </w:r>
-          </w:p>
-        </w:tc>
-      </w:tr>
-      <w:tr>
-        <w:trPr>
-          <w:trHeight w:val="480"/>
-        </w:trPr>
-        <w:tc>
-          <w:tcPr>
-            <w:tcW w:type="dxa" w:w="9638"/>
-            <w:tcBorders>
-              <w:top w:val="single" w:color="E0E0E0" w:sz="4"/>
-              <w:left w:val="single" w:color="E0E0E0" w:sz="4"/>
-              <w:bottom w:val="single" w:color="E0E0E0" w:sz="4"/>
-              <w:right w:val="single" w:color="E0E0E0" w:sz="4"/>
-            </w:tcBorders>
-            <w:shd w:fill="FAFAFA" w:val="clear"/>
-            <w:tcMar>
-              <w:top w:type="dxa" w:w="60"/>
-              <w:left w:type="dxa" w:w="160"/>
-              <w:bottom w:type="dxa" w:w="60"/>
-              <w:right w:type="dxa" w:w="160"/>
-            </w:tcMar>
-          </w:tcPr>
-          <w:p>
-            <w:r>
-              <w:rPr>
-                <w:sz w:val="22"/>
-                <w:szCs w:val="22"/>
-              </w:rPr>
-              <w:t xml:space="preserve"/>
-            </w:r>
-          </w:p>
-        </w:tc>
-      </w:tr>
-    </w:tbl>
-    <w:p>
-      <w:pPr>
-        <w:spacing w:after="160"/>
-      </w:pPr>
-    </w:p>
-    <w:p>
-      <w:pPr>
-        <w:pBdr>
-          <w:bottom w:val="single" w:color="FFA000" w:sz="4" w:space="1"/>
-        </w:pBdr>
-        <w:spacing w:after="120" w:before="240"/>
-      </w:pPr>
-      <w:r>
-        <w:rPr>
-          <w:rFonts w:ascii="Arial" w:cs="Arial" w:eastAsia="Arial" w:hAnsi="Arial"/>
-          <w:b/>
-          <w:bCs/>
-          <w:color w:val="6D4C41"/>
-          <w:sz w:val="24"/>
-          <w:szCs w:val="24"/>
-        </w:rPr>
-        <w:t xml:space="preserve">Captura — GitHub Actions en verde</w:t>
-      </w:r>
-    </w:p>
-    <w:tbl>
-      <w:tblPr>
-        <w:tblW w:type="dxa" w:w="9638"/>
-        <w:tblBorders>
-          <w:top w:val="single" w:color="auto" w:sz="4"/>
-          <w:left w:val="single" w:color="auto" w:sz="4"/>
-          <w:bottom w:val="single" w:color="auto" w:sz="4"/>
-          <w:right w:val="single" w:color="auto" w:sz="4"/>
-          <w:insideH w:val="single" w:color="auto" w:sz="4"/>
-          <w:insideV w:val="single" w:color="auto" w:sz="4"/>
-        </w:tblBorders>
-      </w:tblPr>
-      <w:tblGrid>
-        <w:gridCol w:w="9638"/>
-      </w:tblGrid>
-      <w:tr>
-        <w:tc>
-          <w:tcPr>
-            <w:tcW w:type="dxa" w:w="9638"/>
-            <w:tcBorders>
-              <w:top w:val="none" w:color="FFFFFF" w:sz="0"/>
-              <w:left w:val="none" w:color="FFFFFF" w:sz="0"/>
-              <w:bottom w:val="none" w:color="FFFFFF" w:sz="0"/>
-              <w:right w:val="none" w:color="FFFFFF" w:sz="0"/>
-            </w:tcBorders>
-            <w:shd w:fill="6D4C41" w:val="clear"/>
-            <w:tcMar>
-              <w:top w:type="dxa" w:w="80"/>
-              <w:left w:type="dxa" w:w="160"/>
-              <w:bottom w:type="dxa" w:w="80"/>
-              <w:right w:type="dxa" w:w="160"/>
-            </w:tcMar>
-          </w:tcPr>
-          <w:p>
-            <w:r>
-              <w:rPr>
-                <w:rFonts w:ascii="Arial" w:cs="Arial" w:eastAsia="Arial" w:hAnsi="Arial"/>
-                <w:b/>
-                <w:bCs/>
-                <w:color w:val="FFFFFF"/>
-                <w:sz w:val="20"/>
-                <w:szCs w:val="20"/>
-              </w:rPr>
-              <w:t xml:space="preserve">📸 El workflow de CI en verde, con SeguridadEndpointsTest entre los tests pasados</w:t>
-            </w:r>
-          </w:p>
-        </w:tc>
-      </w:tr>
-      <w:tr>
-        <w:trPr>
-          <w:trHeight w:val="2400"/>
-        </w:trPr>
-        <w:tc>
-          <w:tcPr>
-            <w:tcW w:type="dxa" w:w="9638"/>
-            <w:tcBorders>
-              <w:top w:val="single" w:color="E0E0E0" w:sz="4"/>
-              <w:left w:val="single" w:color="E0E0E0" w:sz="4"/>
-              <w:bottom w:val="single" w:color="E0E0E0" w:sz="4"/>
-              <w:right w:val="single" w:color="E0E0E0" w:sz="4"/>
-            </w:tcBorders>
-            <w:shd w:fill="FAFAFA" w:val="clear"/>
-            <w:tcMar>
-              <w:top w:type="dxa" w:w="80"/>
-              <w:left w:type="dxa" w:w="160"/>
-              <w:bottom w:type="dxa" w:w="80"/>
-              <w:right w:type="dxa" w:w="160"/>
-            </w:tcMar>
-          </w:tcPr>
-          <w:p>
-            <w:pPr>
-              <w:jc w:val="center"/>
-            </w:pPr>
-            <w:r>
-              <w:rPr>
-                <w:rFonts w:ascii="Arial" w:cs="Arial" w:eastAsia="Arial" w:hAnsi="Arial"/>
-                <w:i/>
-                <w:iCs/>
-                <w:color w:val="757575"/>
-                <w:sz w:val="20"/>
-                <w:szCs w:val="20"/>
-              </w:rPr>
-              <w:t xml:space="preserve">[Pega aquí la captura de pantalla]</w:t>
             </w:r>
           </w:p>
         </w:tc>

</xml_diff>